<commit_message>
Modificacion de documento de librerias
</commit_message>
<xml_diff>
--- a/Producto/Libreria/Librerias.docx
+++ b/Producto/Libreria/Librerias.docx
@@ -95,6 +95,7 @@
           <w:p>
             <w:pPr>
               <w:spacing w:after="200" w:line="276" w:lineRule="auto"/>
+              <w:ind w:left="720" w:firstLine="0"/>
               <w:rPr>
                 <w:rFonts w:ascii="Calibri" w:cs="Calibri" w:eastAsia="Calibri" w:hAnsi="Calibri"/>
                 <w:sz w:val="21"/>
@@ -128,6 +129,7 @@
           <w:p>
             <w:pPr>
               <w:spacing w:after="200" w:line="276" w:lineRule="auto"/>
+              <w:ind w:left="720" w:firstLine="0"/>
               <w:rPr>
                 <w:rFonts w:ascii="Calibri" w:cs="Calibri" w:eastAsia="Calibri" w:hAnsi="Calibri"/>
                 <w:sz w:val="21"/>
@@ -161,6 +163,7 @@
           <w:p>
             <w:pPr>
               <w:spacing w:after="200" w:line="276" w:lineRule="auto"/>
+              <w:ind w:left="720" w:firstLine="0"/>
               <w:rPr>
                 <w:rFonts w:ascii="Calibri" w:cs="Calibri" w:eastAsia="Calibri" w:hAnsi="Calibri"/>
                 <w:sz w:val="21"/>
@@ -199,17 +202,14 @@
           <w:p>
             <w:pPr>
               <w:spacing w:after="200" w:line="276" w:lineRule="auto"/>
-              <w:rPr>
-                <w:rFonts w:ascii="Calibri" w:cs="Calibri" w:eastAsia="Calibri" w:hAnsi="Calibri"/>
-                <w:sz w:val="21"/>
-                <w:szCs w:val="21"/>
-              </w:rPr>
-            </w:pPr>
-            <w:r>
-              <w:rPr>
-                <w:rFonts w:ascii="Calibri" w:cs="Calibri" w:eastAsia="Calibri" w:hAnsi="Calibri"/>
-                <w:sz w:val="14"/>
-                <w:szCs w:val="14"/>
+              <w:ind w:left="720" w:firstLine="0"/>
+              <w:rPr>
+                <w:rFonts w:ascii="Times New Roman" w:cs="Times New Roman" w:eastAsia="Times New Roman" w:hAnsi="Times New Roman"/>
+              </w:rPr>
+            </w:pPr>
+            <w:r>
+              <w:rPr>
+                <w:rFonts w:ascii="Times New Roman" w:cs="Times New Roman" w:eastAsia="Times New Roman" w:hAnsi="Times New Roman"/>
                 <w:rtl w:val="0"/>
               </w:rPr>
               <w:t xml:space="preserve">Frontend</w:t>
@@ -228,17 +228,14 @@
           <w:p>
             <w:pPr>
               <w:spacing w:after="200" w:line="276" w:lineRule="auto"/>
-              <w:rPr>
-                <w:rFonts w:ascii="Calibri" w:cs="Calibri" w:eastAsia="Calibri" w:hAnsi="Calibri"/>
-                <w:sz w:val="21"/>
-                <w:szCs w:val="21"/>
-              </w:rPr>
-            </w:pPr>
-            <w:r>
-              <w:rPr>
-                <w:rFonts w:ascii="Calibri" w:cs="Calibri" w:eastAsia="Calibri" w:hAnsi="Calibri"/>
-                <w:sz w:val="14"/>
-                <w:szCs w:val="14"/>
+              <w:ind w:left="720" w:firstLine="0"/>
+              <w:rPr>
+                <w:rFonts w:ascii="Times New Roman" w:cs="Times New Roman" w:eastAsia="Times New Roman" w:hAnsi="Times New Roman"/>
+              </w:rPr>
+            </w:pPr>
+            <w:r>
+              <w:rPr>
+                <w:rFonts w:ascii="Times New Roman" w:cs="Times New Roman" w:eastAsia="Times New Roman" w:hAnsi="Times New Roman"/>
                 <w:rtl w:val="0"/>
               </w:rPr>
               <w:t xml:space="preserve">React 19 + TypeScript + Vite</w:t>
@@ -257,17 +254,14 @@
           <w:p>
             <w:pPr>
               <w:spacing w:after="200" w:line="276" w:lineRule="auto"/>
-              <w:rPr>
-                <w:rFonts w:ascii="Calibri" w:cs="Calibri" w:eastAsia="Calibri" w:hAnsi="Calibri"/>
-                <w:sz w:val="21"/>
-                <w:szCs w:val="21"/>
-              </w:rPr>
-            </w:pPr>
-            <w:r>
-              <w:rPr>
-                <w:rFonts w:ascii="Calibri" w:cs="Calibri" w:eastAsia="Calibri" w:hAnsi="Calibri"/>
-                <w:sz w:val="14"/>
-                <w:szCs w:val="14"/>
+              <w:ind w:left="720" w:firstLine="0"/>
+              <w:rPr>
+                <w:rFonts w:ascii="Times New Roman" w:cs="Times New Roman" w:eastAsia="Times New Roman" w:hAnsi="Times New Roman"/>
+              </w:rPr>
+            </w:pPr>
+            <w:r>
+              <w:rPr>
+                <w:rFonts w:ascii="Times New Roman" w:cs="Times New Roman" w:eastAsia="Times New Roman" w:hAnsi="Times New Roman"/>
                 <w:rtl w:val="0"/>
               </w:rPr>
               <w:t xml:space="preserve">Construcción de interfaz web, navegación y compilación del frontend.</w:t>
@@ -292,17 +286,14 @@
           <w:p>
             <w:pPr>
               <w:spacing w:after="200" w:line="276" w:lineRule="auto"/>
-              <w:rPr>
-                <w:rFonts w:ascii="Calibri" w:cs="Calibri" w:eastAsia="Calibri" w:hAnsi="Calibri"/>
-                <w:sz w:val="21"/>
-                <w:szCs w:val="21"/>
-              </w:rPr>
-            </w:pPr>
-            <w:r>
-              <w:rPr>
-                <w:rFonts w:ascii="Calibri" w:cs="Calibri" w:eastAsia="Calibri" w:hAnsi="Calibri"/>
-                <w:sz w:val="14"/>
-                <w:szCs w:val="14"/>
+              <w:ind w:left="720" w:firstLine="0"/>
+              <w:rPr>
+                <w:rFonts w:ascii="Times New Roman" w:cs="Times New Roman" w:eastAsia="Times New Roman" w:hAnsi="Times New Roman"/>
+              </w:rPr>
+            </w:pPr>
+            <w:r>
+              <w:rPr>
+                <w:rFonts w:ascii="Times New Roman" w:cs="Times New Roman" w:eastAsia="Times New Roman" w:hAnsi="Times New Roman"/>
                 <w:rtl w:val="0"/>
               </w:rPr>
               <w:t xml:space="preserve">Frontend</w:t>
@@ -321,17 +312,14 @@
           <w:p>
             <w:pPr>
               <w:spacing w:after="200" w:line="276" w:lineRule="auto"/>
-              <w:rPr>
-                <w:rFonts w:ascii="Calibri" w:cs="Calibri" w:eastAsia="Calibri" w:hAnsi="Calibri"/>
-                <w:sz w:val="21"/>
-                <w:szCs w:val="21"/>
-              </w:rPr>
-            </w:pPr>
-            <w:r>
-              <w:rPr>
-                <w:rFonts w:ascii="Calibri" w:cs="Calibri" w:eastAsia="Calibri" w:hAnsi="Calibri"/>
-                <w:sz w:val="14"/>
-                <w:szCs w:val="14"/>
+              <w:ind w:left="720" w:firstLine="0"/>
+              <w:rPr>
+                <w:rFonts w:ascii="Times New Roman" w:cs="Times New Roman" w:eastAsia="Times New Roman" w:hAnsi="Times New Roman"/>
+              </w:rPr>
+            </w:pPr>
+            <w:r>
+              <w:rPr>
+                <w:rFonts w:ascii="Times New Roman" w:cs="Times New Roman" w:eastAsia="Times New Roman" w:hAnsi="Times New Roman"/>
                 <w:rtl w:val="0"/>
               </w:rPr>
               <w:t xml:space="preserve">Axios</w:t>
@@ -350,17 +338,14 @@
           <w:p>
             <w:pPr>
               <w:spacing w:after="200" w:line="276" w:lineRule="auto"/>
-              <w:rPr>
-                <w:rFonts w:ascii="Calibri" w:cs="Calibri" w:eastAsia="Calibri" w:hAnsi="Calibri"/>
-                <w:sz w:val="21"/>
-                <w:szCs w:val="21"/>
-              </w:rPr>
-            </w:pPr>
-            <w:r>
-              <w:rPr>
-                <w:rFonts w:ascii="Calibri" w:cs="Calibri" w:eastAsia="Calibri" w:hAnsi="Calibri"/>
-                <w:sz w:val="14"/>
-                <w:szCs w:val="14"/>
+              <w:ind w:left="720" w:firstLine="0"/>
+              <w:rPr>
+                <w:rFonts w:ascii="Times New Roman" w:cs="Times New Roman" w:eastAsia="Times New Roman" w:hAnsi="Times New Roman"/>
+              </w:rPr>
+            </w:pPr>
+            <w:r>
+              <w:rPr>
+                <w:rFonts w:ascii="Times New Roman" w:cs="Times New Roman" w:eastAsia="Times New Roman" w:hAnsi="Times New Roman"/>
                 <w:rtl w:val="0"/>
               </w:rPr>
               <w:t xml:space="preserve">Comunicación HTTP con la API REST.</w:t>
@@ -385,17 +370,14 @@
           <w:p>
             <w:pPr>
               <w:spacing w:after="200" w:line="276" w:lineRule="auto"/>
-              <w:rPr>
-                <w:rFonts w:ascii="Calibri" w:cs="Calibri" w:eastAsia="Calibri" w:hAnsi="Calibri"/>
-                <w:sz w:val="21"/>
-                <w:szCs w:val="21"/>
-              </w:rPr>
-            </w:pPr>
-            <w:r>
-              <w:rPr>
-                <w:rFonts w:ascii="Calibri" w:cs="Calibri" w:eastAsia="Calibri" w:hAnsi="Calibri"/>
-                <w:sz w:val="14"/>
-                <w:szCs w:val="14"/>
+              <w:ind w:left="720" w:firstLine="0"/>
+              <w:rPr>
+                <w:rFonts w:ascii="Times New Roman" w:cs="Times New Roman" w:eastAsia="Times New Roman" w:hAnsi="Times New Roman"/>
+              </w:rPr>
+            </w:pPr>
+            <w:r>
+              <w:rPr>
+                <w:rFonts w:ascii="Times New Roman" w:cs="Times New Roman" w:eastAsia="Times New Roman" w:hAnsi="Times New Roman"/>
                 <w:rtl w:val="0"/>
               </w:rPr>
               <w:t xml:space="preserve">Frontend</w:t>
@@ -414,17 +396,14 @@
           <w:p>
             <w:pPr>
               <w:spacing w:after="200" w:line="276" w:lineRule="auto"/>
-              <w:rPr>
-                <w:rFonts w:ascii="Calibri" w:cs="Calibri" w:eastAsia="Calibri" w:hAnsi="Calibri"/>
-                <w:sz w:val="21"/>
-                <w:szCs w:val="21"/>
-              </w:rPr>
-            </w:pPr>
-            <w:r>
-              <w:rPr>
-                <w:rFonts w:ascii="Calibri" w:cs="Calibri" w:eastAsia="Calibri" w:hAnsi="Calibri"/>
-                <w:sz w:val="14"/>
-                <w:szCs w:val="14"/>
+              <w:ind w:left="720" w:firstLine="0"/>
+              <w:rPr>
+                <w:rFonts w:ascii="Times New Roman" w:cs="Times New Roman" w:eastAsia="Times New Roman" w:hAnsi="Times New Roman"/>
+              </w:rPr>
+            </w:pPr>
+            <w:r>
+              <w:rPr>
+                <w:rFonts w:ascii="Times New Roman" w:cs="Times New Roman" w:eastAsia="Times New Roman" w:hAnsi="Times New Roman"/>
                 <w:rtl w:val="0"/>
               </w:rPr>
               <w:t xml:space="preserve">React Router</w:t>
@@ -443,17 +422,14 @@
           <w:p>
             <w:pPr>
               <w:spacing w:after="200" w:line="276" w:lineRule="auto"/>
-              <w:rPr>
-                <w:rFonts w:ascii="Calibri" w:cs="Calibri" w:eastAsia="Calibri" w:hAnsi="Calibri"/>
-                <w:sz w:val="21"/>
-                <w:szCs w:val="21"/>
-              </w:rPr>
-            </w:pPr>
-            <w:r>
-              <w:rPr>
-                <w:rFonts w:ascii="Calibri" w:cs="Calibri" w:eastAsia="Calibri" w:hAnsi="Calibri"/>
-                <w:sz w:val="14"/>
-                <w:szCs w:val="14"/>
+              <w:ind w:left="720" w:firstLine="0"/>
+              <w:rPr>
+                <w:rFonts w:ascii="Times New Roman" w:cs="Times New Roman" w:eastAsia="Times New Roman" w:hAnsi="Times New Roman"/>
+              </w:rPr>
+            </w:pPr>
+            <w:r>
+              <w:rPr>
+                <w:rFonts w:ascii="Times New Roman" w:cs="Times New Roman" w:eastAsia="Times New Roman" w:hAnsi="Times New Roman"/>
                 <w:rtl w:val="0"/>
               </w:rPr>
               <w:t xml:space="preserve">Definición de rutas y navegación.</w:t>
@@ -478,17 +454,14 @@
           <w:p>
             <w:pPr>
               <w:spacing w:after="200" w:line="276" w:lineRule="auto"/>
-              <w:rPr>
-                <w:rFonts w:ascii="Calibri" w:cs="Calibri" w:eastAsia="Calibri" w:hAnsi="Calibri"/>
-                <w:sz w:val="21"/>
-                <w:szCs w:val="21"/>
-              </w:rPr>
-            </w:pPr>
-            <w:r>
-              <w:rPr>
-                <w:rFonts w:ascii="Calibri" w:cs="Calibri" w:eastAsia="Calibri" w:hAnsi="Calibri"/>
-                <w:sz w:val="14"/>
-                <w:szCs w:val="14"/>
+              <w:ind w:left="720" w:firstLine="0"/>
+              <w:rPr>
+                <w:rFonts w:ascii="Times New Roman" w:cs="Times New Roman" w:eastAsia="Times New Roman" w:hAnsi="Times New Roman"/>
+              </w:rPr>
+            </w:pPr>
+            <w:r>
+              <w:rPr>
+                <w:rFonts w:ascii="Times New Roman" w:cs="Times New Roman" w:eastAsia="Times New Roman" w:hAnsi="Times New Roman"/>
                 <w:rtl w:val="0"/>
               </w:rPr>
               <w:t xml:space="preserve">Frontend</w:t>
@@ -507,17 +480,14 @@
           <w:p>
             <w:pPr>
               <w:spacing w:after="200" w:line="276" w:lineRule="auto"/>
-              <w:rPr>
-                <w:rFonts w:ascii="Calibri" w:cs="Calibri" w:eastAsia="Calibri" w:hAnsi="Calibri"/>
-                <w:sz w:val="21"/>
-                <w:szCs w:val="21"/>
-              </w:rPr>
-            </w:pPr>
-            <w:r>
-              <w:rPr>
-                <w:rFonts w:ascii="Calibri" w:cs="Calibri" w:eastAsia="Calibri" w:hAnsi="Calibri"/>
-                <w:sz w:val="14"/>
-                <w:szCs w:val="14"/>
+              <w:ind w:left="720" w:firstLine="0"/>
+              <w:rPr>
+                <w:rFonts w:ascii="Times New Roman" w:cs="Times New Roman" w:eastAsia="Times New Roman" w:hAnsi="Times New Roman"/>
+              </w:rPr>
+            </w:pPr>
+            <w:r>
+              <w:rPr>
+                <w:rFonts w:ascii="Times New Roman" w:cs="Times New Roman" w:eastAsia="Times New Roman" w:hAnsi="Times New Roman"/>
                 <w:rtl w:val="0"/>
               </w:rPr>
               <w:t xml:space="preserve">React Hook Form</w:t>
@@ -536,17 +506,14 @@
           <w:p>
             <w:pPr>
               <w:spacing w:after="200" w:line="276" w:lineRule="auto"/>
-              <w:rPr>
-                <w:rFonts w:ascii="Calibri" w:cs="Calibri" w:eastAsia="Calibri" w:hAnsi="Calibri"/>
-                <w:sz w:val="21"/>
-                <w:szCs w:val="21"/>
-              </w:rPr>
-            </w:pPr>
-            <w:r>
-              <w:rPr>
-                <w:rFonts w:ascii="Calibri" w:cs="Calibri" w:eastAsia="Calibri" w:hAnsi="Calibri"/>
-                <w:sz w:val="14"/>
-                <w:szCs w:val="14"/>
+              <w:ind w:left="720" w:firstLine="0"/>
+              <w:rPr>
+                <w:rFonts w:ascii="Times New Roman" w:cs="Times New Roman" w:eastAsia="Times New Roman" w:hAnsi="Times New Roman"/>
+              </w:rPr>
+            </w:pPr>
+            <w:r>
+              <w:rPr>
+                <w:rFonts w:ascii="Times New Roman" w:cs="Times New Roman" w:eastAsia="Times New Roman" w:hAnsi="Times New Roman"/>
                 <w:rtl w:val="0"/>
               </w:rPr>
               <w:t xml:space="preserve">Gestión de formularios y validaciones en cliente.</w:t>
@@ -571,17 +538,14 @@
           <w:p>
             <w:pPr>
               <w:spacing w:after="200" w:line="276" w:lineRule="auto"/>
-              <w:rPr>
-                <w:rFonts w:ascii="Calibri" w:cs="Calibri" w:eastAsia="Calibri" w:hAnsi="Calibri"/>
-                <w:sz w:val="21"/>
-                <w:szCs w:val="21"/>
-              </w:rPr>
-            </w:pPr>
-            <w:r>
-              <w:rPr>
-                <w:rFonts w:ascii="Calibri" w:cs="Calibri" w:eastAsia="Calibri" w:hAnsi="Calibri"/>
-                <w:sz w:val="14"/>
-                <w:szCs w:val="14"/>
+              <w:ind w:left="720" w:firstLine="0"/>
+              <w:rPr>
+                <w:rFonts w:ascii="Times New Roman" w:cs="Times New Roman" w:eastAsia="Times New Roman" w:hAnsi="Times New Roman"/>
+              </w:rPr>
+            </w:pPr>
+            <w:r>
+              <w:rPr>
+                <w:rFonts w:ascii="Times New Roman" w:cs="Times New Roman" w:eastAsia="Times New Roman" w:hAnsi="Times New Roman"/>
                 <w:rtl w:val="0"/>
               </w:rPr>
               <w:t xml:space="preserve">Frontend</w:t>
@@ -600,17 +564,14 @@
           <w:p>
             <w:pPr>
               <w:spacing w:after="200" w:line="276" w:lineRule="auto"/>
-              <w:rPr>
-                <w:rFonts w:ascii="Calibri" w:cs="Calibri" w:eastAsia="Calibri" w:hAnsi="Calibri"/>
-                <w:sz w:val="21"/>
-                <w:szCs w:val="21"/>
-              </w:rPr>
-            </w:pPr>
-            <w:r>
-              <w:rPr>
-                <w:rFonts w:ascii="Calibri" w:cs="Calibri" w:eastAsia="Calibri" w:hAnsi="Calibri"/>
-                <w:sz w:val="14"/>
-                <w:szCs w:val="14"/>
+              <w:ind w:left="720" w:firstLine="0"/>
+              <w:rPr>
+                <w:rFonts w:ascii="Times New Roman" w:cs="Times New Roman" w:eastAsia="Times New Roman" w:hAnsi="Times New Roman"/>
+              </w:rPr>
+            </w:pPr>
+            <w:r>
+              <w:rPr>
+                <w:rFonts w:ascii="Times New Roman" w:cs="Times New Roman" w:eastAsia="Times New Roman" w:hAnsi="Times New Roman"/>
                 <w:rtl w:val="0"/>
               </w:rPr>
               <w:t xml:space="preserve">Tailwind CSS</w:t>
@@ -629,17 +590,14 @@
           <w:p>
             <w:pPr>
               <w:spacing w:after="200" w:line="276" w:lineRule="auto"/>
-              <w:rPr>
-                <w:rFonts w:ascii="Calibri" w:cs="Calibri" w:eastAsia="Calibri" w:hAnsi="Calibri"/>
-                <w:sz w:val="21"/>
-                <w:szCs w:val="21"/>
-              </w:rPr>
-            </w:pPr>
-            <w:r>
-              <w:rPr>
-                <w:rFonts w:ascii="Calibri" w:cs="Calibri" w:eastAsia="Calibri" w:hAnsi="Calibri"/>
-                <w:sz w:val="14"/>
-                <w:szCs w:val="14"/>
+              <w:ind w:left="720" w:firstLine="0"/>
+              <w:rPr>
+                <w:rFonts w:ascii="Times New Roman" w:cs="Times New Roman" w:eastAsia="Times New Roman" w:hAnsi="Times New Roman"/>
+              </w:rPr>
+            </w:pPr>
+            <w:r>
+              <w:rPr>
+                <w:rFonts w:ascii="Times New Roman" w:cs="Times New Roman" w:eastAsia="Times New Roman" w:hAnsi="Times New Roman"/>
                 <w:rtl w:val="0"/>
               </w:rPr>
               <w:t xml:space="preserve">Estilos y diseño visual.</w:t>
@@ -664,17 +622,14 @@
           <w:p>
             <w:pPr>
               <w:spacing w:after="200" w:line="276" w:lineRule="auto"/>
-              <w:rPr>
-                <w:rFonts w:ascii="Calibri" w:cs="Calibri" w:eastAsia="Calibri" w:hAnsi="Calibri"/>
-                <w:sz w:val="21"/>
-                <w:szCs w:val="21"/>
-              </w:rPr>
-            </w:pPr>
-            <w:r>
-              <w:rPr>
-                <w:rFonts w:ascii="Calibri" w:cs="Calibri" w:eastAsia="Calibri" w:hAnsi="Calibri"/>
-                <w:sz w:val="14"/>
-                <w:szCs w:val="14"/>
+              <w:ind w:left="720" w:firstLine="0"/>
+              <w:rPr>
+                <w:rFonts w:ascii="Times New Roman" w:cs="Times New Roman" w:eastAsia="Times New Roman" w:hAnsi="Times New Roman"/>
+              </w:rPr>
+            </w:pPr>
+            <w:r>
+              <w:rPr>
+                <w:rFonts w:ascii="Times New Roman" w:cs="Times New Roman" w:eastAsia="Times New Roman" w:hAnsi="Times New Roman"/>
                 <w:rtl w:val="0"/>
               </w:rPr>
               <w:t xml:space="preserve">Frontend</w:t>
@@ -693,26 +648,21 @@
           <w:p>
             <w:pPr>
               <w:spacing w:after="200" w:line="276" w:lineRule="auto"/>
-              <w:rPr>
-                <w:rFonts w:ascii="Calibri" w:cs="Calibri" w:eastAsia="Calibri" w:hAnsi="Calibri"/>
-                <w:sz w:val="14"/>
-                <w:szCs w:val="14"/>
-              </w:rPr>
-            </w:pPr>
-            <w:r>
-              <w:rPr>
-                <w:rFonts w:ascii="Calibri" w:cs="Calibri" w:eastAsia="Calibri" w:hAnsi="Calibri"/>
-                <w:sz w:val="14"/>
-                <w:szCs w:val="14"/>
+              <w:ind w:left="720" w:firstLine="0"/>
+              <w:rPr>
+                <w:rFonts w:ascii="Times New Roman" w:cs="Times New Roman" w:eastAsia="Times New Roman" w:hAnsi="Times New Roman"/>
+              </w:rPr>
+            </w:pPr>
+            <w:r>
+              <w:rPr>
+                <w:rFonts w:ascii="Times New Roman" w:cs="Times New Roman" w:eastAsia="Times New Roman" w:hAnsi="Times New Roman"/>
                 <w:rtl w:val="0"/>
               </w:rPr>
               <w:t xml:space="preserve">React </w:t>
             </w:r>
             <w:r>
               <w:rPr>
-                <w:rFonts w:ascii="Calibri" w:cs="Calibri" w:eastAsia="Calibri" w:hAnsi="Calibri"/>
-                <w:sz w:val="14"/>
-                <w:szCs w:val="14"/>
+                <w:rFonts w:ascii="Times New Roman" w:cs="Times New Roman" w:eastAsia="Times New Roman" w:hAnsi="Times New Roman"/>
                 <w:rtl w:val="0"/>
               </w:rPr>
               <w:t xml:space="preserve">Leaflet</w:t>
@@ -726,17 +676,14 @@
           <w:p>
             <w:pPr>
               <w:spacing w:after="200" w:line="276" w:lineRule="auto"/>
-              <w:rPr>
-                <w:rFonts w:ascii="Calibri" w:cs="Calibri" w:eastAsia="Calibri" w:hAnsi="Calibri"/>
-                <w:sz w:val="14"/>
-                <w:szCs w:val="14"/>
-              </w:rPr>
-            </w:pPr>
-            <w:r>
-              <w:rPr>
-                <w:rFonts w:ascii="Calibri" w:cs="Calibri" w:eastAsia="Calibri" w:hAnsi="Calibri"/>
-                <w:sz w:val="14"/>
-                <w:szCs w:val="14"/>
+              <w:ind w:left="720" w:firstLine="0"/>
+              <w:rPr>
+                <w:rFonts w:ascii="Times New Roman" w:cs="Times New Roman" w:eastAsia="Times New Roman" w:hAnsi="Times New Roman"/>
+              </w:rPr>
+            </w:pPr>
+            <w:r>
+              <w:rPr>
+                <w:rFonts w:ascii="Times New Roman" w:cs="Times New Roman" w:eastAsia="Times New Roman" w:hAnsi="Times New Roman"/>
                 <w:rtl w:val="0"/>
               </w:rPr>
               <w:t xml:space="preserve">Geolocalización </w:t>
@@ -756,17 +703,14 @@
           <w:p>
             <w:pPr>
               <w:spacing w:after="200" w:line="276" w:lineRule="auto"/>
-              <w:rPr>
-                <w:rFonts w:ascii="Calibri" w:cs="Calibri" w:eastAsia="Calibri" w:hAnsi="Calibri"/>
-                <w:sz w:val="21"/>
-                <w:szCs w:val="21"/>
-              </w:rPr>
-            </w:pPr>
-            <w:r>
-              <w:rPr>
-                <w:rFonts w:ascii="Calibri" w:cs="Calibri" w:eastAsia="Calibri" w:hAnsi="Calibri"/>
-                <w:sz w:val="14"/>
-                <w:szCs w:val="14"/>
+              <w:ind w:left="720" w:firstLine="0"/>
+              <w:rPr>
+                <w:rFonts w:ascii="Times New Roman" w:cs="Times New Roman" w:eastAsia="Times New Roman" w:hAnsi="Times New Roman"/>
+              </w:rPr>
+            </w:pPr>
+            <w:r>
+              <w:rPr>
+                <w:rFonts w:ascii="Times New Roman" w:cs="Times New Roman" w:eastAsia="Times New Roman" w:hAnsi="Times New Roman"/>
                 <w:rtl w:val="0"/>
               </w:rPr>
               <w:t xml:space="preserve">Backend</w:t>
@@ -785,17 +729,14 @@
           <w:p>
             <w:pPr>
               <w:spacing w:after="200" w:line="276" w:lineRule="auto"/>
-              <w:rPr>
-                <w:rFonts w:ascii="Calibri" w:cs="Calibri" w:eastAsia="Calibri" w:hAnsi="Calibri"/>
-                <w:sz w:val="21"/>
-                <w:szCs w:val="21"/>
-              </w:rPr>
-            </w:pPr>
-            <w:r>
-              <w:rPr>
-                <w:rFonts w:ascii="Calibri" w:cs="Calibri" w:eastAsia="Calibri" w:hAnsi="Calibri"/>
-                <w:sz w:val="14"/>
-                <w:szCs w:val="14"/>
+              <w:ind w:left="720" w:firstLine="0"/>
+              <w:rPr>
+                <w:rFonts w:ascii="Times New Roman" w:cs="Times New Roman" w:eastAsia="Times New Roman" w:hAnsi="Times New Roman"/>
+              </w:rPr>
+            </w:pPr>
+            <w:r>
+              <w:rPr>
+                <w:rFonts w:ascii="Times New Roman" w:cs="Times New Roman" w:eastAsia="Times New Roman" w:hAnsi="Times New Roman"/>
                 <w:rtl w:val="0"/>
               </w:rPr>
               <w:t xml:space="preserve">Java 21 + Spring Boot 4</w:t>
@@ -814,17 +755,14 @@
           <w:p>
             <w:pPr>
               <w:spacing w:after="200" w:line="276" w:lineRule="auto"/>
-              <w:rPr>
-                <w:rFonts w:ascii="Calibri" w:cs="Calibri" w:eastAsia="Calibri" w:hAnsi="Calibri"/>
-                <w:sz w:val="21"/>
-                <w:szCs w:val="21"/>
-              </w:rPr>
-            </w:pPr>
-            <w:r>
-              <w:rPr>
-                <w:rFonts w:ascii="Calibri" w:cs="Calibri" w:eastAsia="Calibri" w:hAnsi="Calibri"/>
-                <w:sz w:val="14"/>
-                <w:szCs w:val="14"/>
+              <w:ind w:left="720" w:firstLine="0"/>
+              <w:rPr>
+                <w:rFonts w:ascii="Times New Roman" w:cs="Times New Roman" w:eastAsia="Times New Roman" w:hAnsi="Times New Roman"/>
+              </w:rPr>
+            </w:pPr>
+            <w:r>
+              <w:rPr>
+                <w:rFonts w:ascii="Times New Roman" w:cs="Times New Roman" w:eastAsia="Times New Roman" w:hAnsi="Times New Roman"/>
                 <w:rtl w:val="0"/>
               </w:rPr>
               <w:t xml:space="preserve">Construcción de API REST y lógica de negocio.</w:t>
@@ -849,17 +787,14 @@
           <w:p>
             <w:pPr>
               <w:spacing w:after="200" w:line="276" w:lineRule="auto"/>
-              <w:rPr>
-                <w:rFonts w:ascii="Calibri" w:cs="Calibri" w:eastAsia="Calibri" w:hAnsi="Calibri"/>
-                <w:sz w:val="21"/>
-                <w:szCs w:val="21"/>
-              </w:rPr>
-            </w:pPr>
-            <w:r>
-              <w:rPr>
-                <w:rFonts w:ascii="Calibri" w:cs="Calibri" w:eastAsia="Calibri" w:hAnsi="Calibri"/>
-                <w:sz w:val="14"/>
-                <w:szCs w:val="14"/>
+              <w:ind w:left="720" w:firstLine="0"/>
+              <w:rPr>
+                <w:rFonts w:ascii="Times New Roman" w:cs="Times New Roman" w:eastAsia="Times New Roman" w:hAnsi="Times New Roman"/>
+              </w:rPr>
+            </w:pPr>
+            <w:r>
+              <w:rPr>
+                <w:rFonts w:ascii="Times New Roman" w:cs="Times New Roman" w:eastAsia="Times New Roman" w:hAnsi="Times New Roman"/>
                 <w:rtl w:val="0"/>
               </w:rPr>
               <w:t xml:space="preserve">Backend</w:t>
@@ -878,17 +813,14 @@
           <w:p>
             <w:pPr>
               <w:spacing w:after="200" w:line="276" w:lineRule="auto"/>
-              <w:rPr>
-                <w:rFonts w:ascii="Calibri" w:cs="Calibri" w:eastAsia="Calibri" w:hAnsi="Calibri"/>
-                <w:sz w:val="21"/>
-                <w:szCs w:val="21"/>
-              </w:rPr>
-            </w:pPr>
-            <w:r>
-              <w:rPr>
-                <w:rFonts w:ascii="Calibri" w:cs="Calibri" w:eastAsia="Calibri" w:hAnsi="Calibri"/>
-                <w:sz w:val="14"/>
-                <w:szCs w:val="14"/>
+              <w:ind w:left="720" w:firstLine="0"/>
+              <w:rPr>
+                <w:rFonts w:ascii="Times New Roman" w:cs="Times New Roman" w:eastAsia="Times New Roman" w:hAnsi="Times New Roman"/>
+              </w:rPr>
+            </w:pPr>
+            <w:r>
+              <w:rPr>
+                <w:rFonts w:ascii="Times New Roman" w:cs="Times New Roman" w:eastAsia="Times New Roman" w:hAnsi="Times New Roman"/>
                 <w:rtl w:val="0"/>
               </w:rPr>
               <w:t xml:space="preserve">Spring Security + JWT</w:t>
@@ -907,17 +839,14 @@
           <w:p>
             <w:pPr>
               <w:spacing w:after="200" w:line="276" w:lineRule="auto"/>
-              <w:rPr>
-                <w:rFonts w:ascii="Calibri" w:cs="Calibri" w:eastAsia="Calibri" w:hAnsi="Calibri"/>
-                <w:sz w:val="21"/>
-                <w:szCs w:val="21"/>
-              </w:rPr>
-            </w:pPr>
-            <w:r>
-              <w:rPr>
-                <w:rFonts w:ascii="Calibri" w:cs="Calibri" w:eastAsia="Calibri" w:hAnsi="Calibri"/>
-                <w:sz w:val="14"/>
-                <w:szCs w:val="14"/>
+              <w:ind w:left="720" w:firstLine="0"/>
+              <w:rPr>
+                <w:rFonts w:ascii="Times New Roman" w:cs="Times New Roman" w:eastAsia="Times New Roman" w:hAnsi="Times New Roman"/>
+              </w:rPr>
+            </w:pPr>
+            <w:r>
+              <w:rPr>
+                <w:rFonts w:ascii="Times New Roman" w:cs="Times New Roman" w:eastAsia="Times New Roman" w:hAnsi="Times New Roman"/>
                 <w:rtl w:val="0"/>
               </w:rPr>
               <w:t xml:space="preserve">Autenticación y autorización por roles.</w:t>
@@ -942,17 +871,14 @@
           <w:p>
             <w:pPr>
               <w:spacing w:after="200" w:line="276" w:lineRule="auto"/>
-              <w:rPr>
-                <w:rFonts w:ascii="Calibri" w:cs="Calibri" w:eastAsia="Calibri" w:hAnsi="Calibri"/>
-                <w:sz w:val="21"/>
-                <w:szCs w:val="21"/>
-              </w:rPr>
-            </w:pPr>
-            <w:r>
-              <w:rPr>
-                <w:rFonts w:ascii="Calibri" w:cs="Calibri" w:eastAsia="Calibri" w:hAnsi="Calibri"/>
-                <w:sz w:val="14"/>
-                <w:szCs w:val="14"/>
+              <w:ind w:left="720" w:firstLine="0"/>
+              <w:rPr>
+                <w:rFonts w:ascii="Times New Roman" w:cs="Times New Roman" w:eastAsia="Times New Roman" w:hAnsi="Times New Roman"/>
+              </w:rPr>
+            </w:pPr>
+            <w:r>
+              <w:rPr>
+                <w:rFonts w:ascii="Times New Roman" w:cs="Times New Roman" w:eastAsia="Times New Roman" w:hAnsi="Times New Roman"/>
                 <w:rtl w:val="0"/>
               </w:rPr>
               <w:t xml:space="preserve">Backend</w:t>
@@ -971,17 +897,14 @@
           <w:p>
             <w:pPr>
               <w:spacing w:after="200" w:line="276" w:lineRule="auto"/>
-              <w:rPr>
-                <w:rFonts w:ascii="Calibri" w:cs="Calibri" w:eastAsia="Calibri" w:hAnsi="Calibri"/>
-                <w:sz w:val="21"/>
-                <w:szCs w:val="21"/>
-              </w:rPr>
-            </w:pPr>
-            <w:r>
-              <w:rPr>
-                <w:rFonts w:ascii="Calibri" w:cs="Calibri" w:eastAsia="Calibri" w:hAnsi="Calibri"/>
-                <w:sz w:val="14"/>
-                <w:szCs w:val="14"/>
+              <w:ind w:left="720" w:firstLine="0"/>
+              <w:rPr>
+                <w:rFonts w:ascii="Times New Roman" w:cs="Times New Roman" w:eastAsia="Times New Roman" w:hAnsi="Times New Roman"/>
+              </w:rPr>
+            </w:pPr>
+            <w:r>
+              <w:rPr>
+                <w:rFonts w:ascii="Times New Roman" w:cs="Times New Roman" w:eastAsia="Times New Roman" w:hAnsi="Times New Roman"/>
                 <w:rtl w:val="0"/>
               </w:rPr>
               <w:t xml:space="preserve">Spring Data JPA / Hibernate</w:t>
@@ -1000,17 +923,14 @@
           <w:p>
             <w:pPr>
               <w:spacing w:after="200" w:line="276" w:lineRule="auto"/>
-              <w:rPr>
-                <w:rFonts w:ascii="Calibri" w:cs="Calibri" w:eastAsia="Calibri" w:hAnsi="Calibri"/>
-                <w:sz w:val="21"/>
-                <w:szCs w:val="21"/>
-              </w:rPr>
-            </w:pPr>
-            <w:r>
-              <w:rPr>
-                <w:rFonts w:ascii="Calibri" w:cs="Calibri" w:eastAsia="Calibri" w:hAnsi="Calibri"/>
-                <w:sz w:val="14"/>
-                <w:szCs w:val="14"/>
+              <w:ind w:left="720" w:firstLine="0"/>
+              <w:rPr>
+                <w:rFonts w:ascii="Times New Roman" w:cs="Times New Roman" w:eastAsia="Times New Roman" w:hAnsi="Times New Roman"/>
+              </w:rPr>
+            </w:pPr>
+            <w:r>
+              <w:rPr>
+                <w:rFonts w:ascii="Times New Roman" w:cs="Times New Roman" w:eastAsia="Times New Roman" w:hAnsi="Times New Roman"/>
                 <w:rtl w:val="0"/>
               </w:rPr>
               <w:t xml:space="preserve">Persistencia de entidades en MySQL.</w:t>
@@ -1035,17 +955,14 @@
           <w:p>
             <w:pPr>
               <w:spacing w:after="200" w:line="276" w:lineRule="auto"/>
-              <w:rPr>
-                <w:rFonts w:ascii="Calibri" w:cs="Calibri" w:eastAsia="Calibri" w:hAnsi="Calibri"/>
-                <w:sz w:val="21"/>
-                <w:szCs w:val="21"/>
-              </w:rPr>
-            </w:pPr>
-            <w:r>
-              <w:rPr>
-                <w:rFonts w:ascii="Calibri" w:cs="Calibri" w:eastAsia="Calibri" w:hAnsi="Calibri"/>
-                <w:sz w:val="14"/>
-                <w:szCs w:val="14"/>
+              <w:ind w:left="720" w:firstLine="0"/>
+              <w:rPr>
+                <w:rFonts w:ascii="Times New Roman" w:cs="Times New Roman" w:eastAsia="Times New Roman" w:hAnsi="Times New Roman"/>
+              </w:rPr>
+            </w:pPr>
+            <w:r>
+              <w:rPr>
+                <w:rFonts w:ascii="Times New Roman" w:cs="Times New Roman" w:eastAsia="Times New Roman" w:hAnsi="Times New Roman"/>
                 <w:rtl w:val="0"/>
               </w:rPr>
               <w:t xml:space="preserve">Backend</w:t>
@@ -1064,17 +981,14 @@
           <w:p>
             <w:pPr>
               <w:spacing w:after="200" w:line="276" w:lineRule="auto"/>
-              <w:rPr>
-                <w:rFonts w:ascii="Calibri" w:cs="Calibri" w:eastAsia="Calibri" w:hAnsi="Calibri"/>
-                <w:sz w:val="21"/>
-                <w:szCs w:val="21"/>
-              </w:rPr>
-            </w:pPr>
-            <w:r>
-              <w:rPr>
-                <w:rFonts w:ascii="Calibri" w:cs="Calibri" w:eastAsia="Calibri" w:hAnsi="Calibri"/>
-                <w:sz w:val="14"/>
-                <w:szCs w:val="14"/>
+              <w:ind w:left="720" w:firstLine="0"/>
+              <w:rPr>
+                <w:rFonts w:ascii="Times New Roman" w:cs="Times New Roman" w:eastAsia="Times New Roman" w:hAnsi="Times New Roman"/>
+              </w:rPr>
+            </w:pPr>
+            <w:r>
+              <w:rPr>
+                <w:rFonts w:ascii="Times New Roman" w:cs="Times New Roman" w:eastAsia="Times New Roman" w:hAnsi="Times New Roman"/>
                 <w:rtl w:val="0"/>
               </w:rPr>
               <w:t xml:space="preserve">Flyway</w:t>
@@ -1093,17 +1007,14 @@
           <w:p>
             <w:pPr>
               <w:spacing w:after="200" w:line="276" w:lineRule="auto"/>
-              <w:rPr>
-                <w:rFonts w:ascii="Calibri" w:cs="Calibri" w:eastAsia="Calibri" w:hAnsi="Calibri"/>
-                <w:sz w:val="21"/>
-                <w:szCs w:val="21"/>
-              </w:rPr>
-            </w:pPr>
-            <w:r>
-              <w:rPr>
-                <w:rFonts w:ascii="Calibri" w:cs="Calibri" w:eastAsia="Calibri" w:hAnsi="Calibri"/>
-                <w:sz w:val="14"/>
-                <w:szCs w:val="14"/>
+              <w:ind w:left="720" w:firstLine="0"/>
+              <w:rPr>
+                <w:rFonts w:ascii="Times New Roman" w:cs="Times New Roman" w:eastAsia="Times New Roman" w:hAnsi="Times New Roman"/>
+              </w:rPr>
+            </w:pPr>
+            <w:r>
+              <w:rPr>
+                <w:rFonts w:ascii="Times New Roman" w:cs="Times New Roman" w:eastAsia="Times New Roman" w:hAnsi="Times New Roman"/>
                 <w:rtl w:val="0"/>
               </w:rPr>
               <w:t xml:space="preserve">Versionamiento de esquema de base de datos.</w:t>
@@ -1128,17 +1039,14 @@
           <w:p>
             <w:pPr>
               <w:spacing w:after="200" w:line="276" w:lineRule="auto"/>
-              <w:rPr>
-                <w:rFonts w:ascii="Calibri" w:cs="Calibri" w:eastAsia="Calibri" w:hAnsi="Calibri"/>
-                <w:sz w:val="21"/>
-                <w:szCs w:val="21"/>
-              </w:rPr>
-            </w:pPr>
-            <w:r>
-              <w:rPr>
-                <w:rFonts w:ascii="Calibri" w:cs="Calibri" w:eastAsia="Calibri" w:hAnsi="Calibri"/>
-                <w:sz w:val="14"/>
-                <w:szCs w:val="14"/>
+              <w:ind w:left="720" w:firstLine="0"/>
+              <w:rPr>
+                <w:rFonts w:ascii="Times New Roman" w:cs="Times New Roman" w:eastAsia="Times New Roman" w:hAnsi="Times New Roman"/>
+              </w:rPr>
+            </w:pPr>
+            <w:r>
+              <w:rPr>
+                <w:rFonts w:ascii="Times New Roman" w:cs="Times New Roman" w:eastAsia="Times New Roman" w:hAnsi="Times New Roman"/>
                 <w:rtl w:val="0"/>
               </w:rPr>
               <w:t xml:space="preserve">Backend</w:t>
@@ -1157,17 +1065,14 @@
           <w:p>
             <w:pPr>
               <w:spacing w:after="200" w:line="276" w:lineRule="auto"/>
-              <w:rPr>
-                <w:rFonts w:ascii="Calibri" w:cs="Calibri" w:eastAsia="Calibri" w:hAnsi="Calibri"/>
-                <w:sz w:val="21"/>
-                <w:szCs w:val="21"/>
-              </w:rPr>
-            </w:pPr>
-            <w:r>
-              <w:rPr>
-                <w:rFonts w:ascii="Calibri" w:cs="Calibri" w:eastAsia="Calibri" w:hAnsi="Calibri"/>
-                <w:sz w:val="14"/>
-                <w:szCs w:val="14"/>
+              <w:ind w:left="720" w:firstLine="0"/>
+              <w:rPr>
+                <w:rFonts w:ascii="Times New Roman" w:cs="Times New Roman" w:eastAsia="Times New Roman" w:hAnsi="Times New Roman"/>
+              </w:rPr>
+            </w:pPr>
+            <w:r>
+              <w:rPr>
+                <w:rFonts w:ascii="Times New Roman" w:cs="Times New Roman" w:eastAsia="Times New Roman" w:hAnsi="Times New Roman"/>
                 <w:rtl w:val="0"/>
               </w:rPr>
               <w:t xml:space="preserve">Swagger/OpenAPI</w:t>
@@ -1186,17 +1091,14 @@
           <w:p>
             <w:pPr>
               <w:spacing w:after="200" w:line="276" w:lineRule="auto"/>
-              <w:rPr>
-                <w:rFonts w:ascii="Calibri" w:cs="Calibri" w:eastAsia="Calibri" w:hAnsi="Calibri"/>
-                <w:sz w:val="21"/>
-                <w:szCs w:val="21"/>
-              </w:rPr>
-            </w:pPr>
-            <w:r>
-              <w:rPr>
-                <w:rFonts w:ascii="Calibri" w:cs="Calibri" w:eastAsia="Calibri" w:hAnsi="Calibri"/>
-                <w:sz w:val="14"/>
-                <w:szCs w:val="14"/>
+              <w:ind w:left="720" w:firstLine="0"/>
+              <w:rPr>
+                <w:rFonts w:ascii="Times New Roman" w:cs="Times New Roman" w:eastAsia="Times New Roman" w:hAnsi="Times New Roman"/>
+              </w:rPr>
+            </w:pPr>
+            <w:r>
+              <w:rPr>
+                <w:rFonts w:ascii="Times New Roman" w:cs="Times New Roman" w:eastAsia="Times New Roman" w:hAnsi="Times New Roman"/>
                 <w:rtl w:val="0"/>
               </w:rPr>
               <w:t xml:space="preserve">Documentación y prueba de endpoints.</w:t>
@@ -1221,17 +1123,14 @@
           <w:p>
             <w:pPr>
               <w:spacing w:after="200" w:line="276" w:lineRule="auto"/>
-              <w:rPr>
-                <w:rFonts w:ascii="Calibri" w:cs="Calibri" w:eastAsia="Calibri" w:hAnsi="Calibri"/>
-                <w:sz w:val="21"/>
-                <w:szCs w:val="21"/>
-              </w:rPr>
-            </w:pPr>
-            <w:r>
-              <w:rPr>
-                <w:rFonts w:ascii="Calibri" w:cs="Calibri" w:eastAsia="Calibri" w:hAnsi="Calibri"/>
-                <w:sz w:val="14"/>
-                <w:szCs w:val="14"/>
+              <w:ind w:left="720" w:firstLine="0"/>
+              <w:rPr>
+                <w:rFonts w:ascii="Times New Roman" w:cs="Times New Roman" w:eastAsia="Times New Roman" w:hAnsi="Times New Roman"/>
+              </w:rPr>
+            </w:pPr>
+            <w:r>
+              <w:rPr>
+                <w:rFonts w:ascii="Times New Roman" w:cs="Times New Roman" w:eastAsia="Times New Roman" w:hAnsi="Times New Roman"/>
                 <w:rtl w:val="0"/>
               </w:rPr>
               <w:t xml:space="preserve">Backend</w:t>
@@ -1250,17 +1149,14 @@
           <w:p>
             <w:pPr>
               <w:spacing w:after="200" w:line="276" w:lineRule="auto"/>
-              <w:rPr>
-                <w:rFonts w:ascii="Calibri" w:cs="Calibri" w:eastAsia="Calibri" w:hAnsi="Calibri"/>
-                <w:sz w:val="21"/>
-                <w:szCs w:val="21"/>
-              </w:rPr>
-            </w:pPr>
-            <w:r>
-              <w:rPr>
-                <w:rFonts w:ascii="Calibri" w:cs="Calibri" w:eastAsia="Calibri" w:hAnsi="Calibri"/>
-                <w:sz w:val="14"/>
-                <w:szCs w:val="14"/>
+              <w:ind w:left="720" w:firstLine="0"/>
+              <w:rPr>
+                <w:rFonts w:ascii="Times New Roman" w:cs="Times New Roman" w:eastAsia="Times New Roman" w:hAnsi="Times New Roman"/>
+              </w:rPr>
+            </w:pPr>
+            <w:r>
+              <w:rPr>
+                <w:rFonts w:ascii="Times New Roman" w:cs="Times New Roman" w:eastAsia="Times New Roman" w:hAnsi="Times New Roman"/>
                 <w:rtl w:val="0"/>
               </w:rPr>
               <w:t xml:space="preserve">Openpdf</w:t>
@@ -1279,17 +1175,14 @@
           <w:p>
             <w:pPr>
               <w:spacing w:after="200" w:line="276" w:lineRule="auto"/>
-              <w:rPr>
-                <w:rFonts w:ascii="Calibri" w:cs="Calibri" w:eastAsia="Calibri" w:hAnsi="Calibri"/>
-                <w:sz w:val="21"/>
-                <w:szCs w:val="21"/>
-              </w:rPr>
-            </w:pPr>
-            <w:r>
-              <w:rPr>
-                <w:rFonts w:ascii="Calibri" w:cs="Calibri" w:eastAsia="Calibri" w:hAnsi="Calibri"/>
-                <w:sz w:val="14"/>
-                <w:szCs w:val="14"/>
+              <w:ind w:left="720" w:firstLine="0"/>
+              <w:rPr>
+                <w:rFonts w:ascii="Times New Roman" w:cs="Times New Roman" w:eastAsia="Times New Roman" w:hAnsi="Times New Roman"/>
+              </w:rPr>
+            </w:pPr>
+            <w:r>
+              <w:rPr>
+                <w:rFonts w:ascii="Times New Roman" w:cs="Times New Roman" w:eastAsia="Times New Roman" w:hAnsi="Times New Roman"/>
                 <w:rtl w:val="0"/>
               </w:rPr>
               <w:t xml:space="preserve">Base para futura generación de informes PDF.</w:t>
@@ -1314,17 +1207,14 @@
           <w:p>
             <w:pPr>
               <w:spacing w:after="200" w:line="276" w:lineRule="auto"/>
-              <w:rPr>
-                <w:rFonts w:ascii="Calibri" w:cs="Calibri" w:eastAsia="Calibri" w:hAnsi="Calibri"/>
-                <w:sz w:val="21"/>
-                <w:szCs w:val="21"/>
-              </w:rPr>
-            </w:pPr>
-            <w:r>
-              <w:rPr>
-                <w:rFonts w:ascii="Calibri" w:cs="Calibri" w:eastAsia="Calibri" w:hAnsi="Calibri"/>
-                <w:sz w:val="14"/>
-                <w:szCs w:val="14"/>
+              <w:ind w:left="720" w:firstLine="0"/>
+              <w:rPr>
+                <w:rFonts w:ascii="Times New Roman" w:cs="Times New Roman" w:eastAsia="Times New Roman" w:hAnsi="Times New Roman"/>
+              </w:rPr>
+            </w:pPr>
+            <w:r>
+              <w:rPr>
+                <w:rFonts w:ascii="Times New Roman" w:cs="Times New Roman" w:eastAsia="Times New Roman" w:hAnsi="Times New Roman"/>
                 <w:rtl w:val="0"/>
               </w:rPr>
               <w:t xml:space="preserve">Backend</w:t>
@@ -1343,17 +1233,14 @@
           <w:p>
             <w:pPr>
               <w:spacing w:after="200" w:line="276" w:lineRule="auto"/>
-              <w:rPr>
-                <w:rFonts w:ascii="Calibri" w:cs="Calibri" w:eastAsia="Calibri" w:hAnsi="Calibri"/>
-                <w:sz w:val="21"/>
-                <w:szCs w:val="21"/>
-              </w:rPr>
-            </w:pPr>
-            <w:r>
-              <w:rPr>
-                <w:rFonts w:ascii="Calibri" w:cs="Calibri" w:eastAsia="Calibri" w:hAnsi="Calibri"/>
-                <w:sz w:val="14"/>
-                <w:szCs w:val="14"/>
+              <w:ind w:left="720" w:firstLine="0"/>
+              <w:rPr>
+                <w:rFonts w:ascii="Times New Roman" w:cs="Times New Roman" w:eastAsia="Times New Roman" w:hAnsi="Times New Roman"/>
+              </w:rPr>
+            </w:pPr>
+            <w:r>
+              <w:rPr>
+                <w:rFonts w:ascii="Times New Roman" w:cs="Times New Roman" w:eastAsia="Times New Roman" w:hAnsi="Times New Roman"/>
                 <w:rtl w:val="0"/>
               </w:rPr>
               <w:t xml:space="preserve">AWS SDK S3</w:t>
@@ -1372,17 +1259,14 @@
           <w:p>
             <w:pPr>
               <w:spacing w:after="200" w:line="276" w:lineRule="auto"/>
-              <w:rPr>
-                <w:rFonts w:ascii="Calibri" w:cs="Calibri" w:eastAsia="Calibri" w:hAnsi="Calibri"/>
-                <w:sz w:val="21"/>
-                <w:szCs w:val="21"/>
-              </w:rPr>
-            </w:pPr>
-            <w:r>
-              <w:rPr>
-                <w:rFonts w:ascii="Calibri" w:cs="Calibri" w:eastAsia="Calibri" w:hAnsi="Calibri"/>
-                <w:sz w:val="14"/>
-                <w:szCs w:val="14"/>
+              <w:ind w:left="720" w:firstLine="0"/>
+              <w:rPr>
+                <w:rFonts w:ascii="Times New Roman" w:cs="Times New Roman" w:eastAsia="Times New Roman" w:hAnsi="Times New Roman"/>
+              </w:rPr>
+            </w:pPr>
+            <w:r>
+              <w:rPr>
+                <w:rFonts w:ascii="Times New Roman" w:cs="Times New Roman" w:eastAsia="Times New Roman" w:hAnsi="Times New Roman"/>
                 <w:rtl w:val="0"/>
               </w:rPr>
               <w:t xml:space="preserve">Base para futuro almacenamiento de documentos en S3.</w:t>
@@ -1407,17 +1291,14 @@
           <w:p>
             <w:pPr>
               <w:spacing w:after="200" w:line="276" w:lineRule="auto"/>
-              <w:rPr>
-                <w:rFonts w:ascii="Calibri" w:cs="Calibri" w:eastAsia="Calibri" w:hAnsi="Calibri"/>
-                <w:sz w:val="21"/>
-                <w:szCs w:val="21"/>
-              </w:rPr>
-            </w:pPr>
-            <w:r>
-              <w:rPr>
-                <w:rFonts w:ascii="Calibri" w:cs="Calibri" w:eastAsia="Calibri" w:hAnsi="Calibri"/>
-                <w:sz w:val="14"/>
-                <w:szCs w:val="14"/>
+              <w:ind w:left="720" w:firstLine="0"/>
+              <w:rPr>
+                <w:rFonts w:ascii="Times New Roman" w:cs="Times New Roman" w:eastAsia="Times New Roman" w:hAnsi="Times New Roman"/>
+              </w:rPr>
+            </w:pPr>
+            <w:r>
+              <w:rPr>
+                <w:rFonts w:ascii="Times New Roman" w:cs="Times New Roman" w:eastAsia="Times New Roman" w:hAnsi="Times New Roman"/>
                 <w:rtl w:val="0"/>
               </w:rPr>
               <w:t xml:space="preserve">Base de datos</w:t>
@@ -1436,17 +1317,14 @@
           <w:p>
             <w:pPr>
               <w:spacing w:after="200" w:line="276" w:lineRule="auto"/>
-              <w:rPr>
-                <w:rFonts w:ascii="Calibri" w:cs="Calibri" w:eastAsia="Calibri" w:hAnsi="Calibri"/>
-                <w:sz w:val="21"/>
-                <w:szCs w:val="21"/>
-              </w:rPr>
-            </w:pPr>
-            <w:r>
-              <w:rPr>
-                <w:rFonts w:ascii="Calibri" w:cs="Calibri" w:eastAsia="Calibri" w:hAnsi="Calibri"/>
-                <w:sz w:val="14"/>
-                <w:szCs w:val="14"/>
+              <w:ind w:left="720" w:firstLine="0"/>
+              <w:rPr>
+                <w:rFonts w:ascii="Times New Roman" w:cs="Times New Roman" w:eastAsia="Times New Roman" w:hAnsi="Times New Roman"/>
+              </w:rPr>
+            </w:pPr>
+            <w:r>
+              <w:rPr>
+                <w:rFonts w:ascii="Times New Roman" w:cs="Times New Roman" w:eastAsia="Times New Roman" w:hAnsi="Times New Roman"/>
                 <w:rtl w:val="0"/>
               </w:rPr>
               <w:t xml:space="preserve">MySQL</w:t>
@@ -1465,17 +1343,14 @@
           <w:p>
             <w:pPr>
               <w:spacing w:after="200" w:line="276" w:lineRule="auto"/>
-              <w:rPr>
-                <w:rFonts w:ascii="Calibri" w:cs="Calibri" w:eastAsia="Calibri" w:hAnsi="Calibri"/>
-                <w:sz w:val="21"/>
-                <w:szCs w:val="21"/>
-              </w:rPr>
-            </w:pPr>
-            <w:r>
-              <w:rPr>
-                <w:rFonts w:ascii="Calibri" w:cs="Calibri" w:eastAsia="Calibri" w:hAnsi="Calibri"/>
-                <w:sz w:val="14"/>
-                <w:szCs w:val="14"/>
+              <w:ind w:left="720" w:firstLine="0"/>
+              <w:rPr>
+                <w:rFonts w:ascii="Times New Roman" w:cs="Times New Roman" w:eastAsia="Times New Roman" w:hAnsi="Times New Roman"/>
+              </w:rPr>
+            </w:pPr>
+            <w:r>
+              <w:rPr>
+                <w:rFonts w:ascii="Times New Roman" w:cs="Times New Roman" w:eastAsia="Times New Roman" w:hAnsi="Times New Roman"/>
                 <w:rtl w:val="0"/>
               </w:rPr>
               <w:t xml:space="preserve">Gestión relacional de usuarios, roles, profesionales y clientes.</w:t>
@@ -1500,17 +1375,14 @@
           <w:p>
             <w:pPr>
               <w:spacing w:after="200" w:line="276" w:lineRule="auto"/>
-              <w:rPr>
-                <w:rFonts w:ascii="Calibri" w:cs="Calibri" w:eastAsia="Calibri" w:hAnsi="Calibri"/>
-                <w:sz w:val="21"/>
-                <w:szCs w:val="21"/>
-              </w:rPr>
-            </w:pPr>
-            <w:r>
-              <w:rPr>
-                <w:rFonts w:ascii="Calibri" w:cs="Calibri" w:eastAsia="Calibri" w:hAnsi="Calibri"/>
-                <w:sz w:val="14"/>
-                <w:szCs w:val="14"/>
+              <w:ind w:left="720" w:firstLine="0"/>
+              <w:rPr>
+                <w:rFonts w:ascii="Times New Roman" w:cs="Times New Roman" w:eastAsia="Times New Roman" w:hAnsi="Times New Roman"/>
+              </w:rPr>
+            </w:pPr>
+            <w:r>
+              <w:rPr>
+                <w:rFonts w:ascii="Times New Roman" w:cs="Times New Roman" w:eastAsia="Times New Roman" w:hAnsi="Times New Roman"/>
                 <w:rtl w:val="0"/>
               </w:rPr>
               <w:t xml:space="preserve">Herramientas</w:t>
@@ -1529,17 +1401,14 @@
           <w:p>
             <w:pPr>
               <w:spacing w:after="200" w:line="276" w:lineRule="auto"/>
-              <w:rPr>
-                <w:rFonts w:ascii="Calibri" w:cs="Calibri" w:eastAsia="Calibri" w:hAnsi="Calibri"/>
-                <w:sz w:val="21"/>
-                <w:szCs w:val="21"/>
-              </w:rPr>
-            </w:pPr>
-            <w:r>
-              <w:rPr>
-                <w:rFonts w:ascii="Calibri" w:cs="Calibri" w:eastAsia="Calibri" w:hAnsi="Calibri"/>
-                <w:sz w:val="14"/>
-                <w:szCs w:val="14"/>
+              <w:ind w:left="720" w:firstLine="0"/>
+              <w:rPr>
+                <w:rFonts w:ascii="Times New Roman" w:cs="Times New Roman" w:eastAsia="Times New Roman" w:hAnsi="Times New Roman"/>
+              </w:rPr>
+            </w:pPr>
+            <w:r>
+              <w:rPr>
+                <w:rFonts w:ascii="Times New Roman" w:cs="Times New Roman" w:eastAsia="Times New Roman" w:hAnsi="Times New Roman"/>
                 <w:rtl w:val="0"/>
               </w:rPr>
               <w:t xml:space="preserve">Git y GitHub</w:t>
@@ -1558,17 +1427,14 @@
           <w:p>
             <w:pPr>
               <w:spacing w:after="200" w:line="276" w:lineRule="auto"/>
-              <w:rPr>
-                <w:rFonts w:ascii="Calibri" w:cs="Calibri" w:eastAsia="Calibri" w:hAnsi="Calibri"/>
-                <w:sz w:val="21"/>
-                <w:szCs w:val="21"/>
-              </w:rPr>
-            </w:pPr>
-            <w:r>
-              <w:rPr>
-                <w:rFonts w:ascii="Calibri" w:cs="Calibri" w:eastAsia="Calibri" w:hAnsi="Calibri"/>
-                <w:sz w:val="14"/>
-                <w:szCs w:val="14"/>
+              <w:ind w:left="720" w:firstLine="0"/>
+              <w:rPr>
+                <w:rFonts w:ascii="Times New Roman" w:cs="Times New Roman" w:eastAsia="Times New Roman" w:hAnsi="Times New Roman"/>
+              </w:rPr>
+            </w:pPr>
+            <w:r>
+              <w:rPr>
+                <w:rFonts w:ascii="Times New Roman" w:cs="Times New Roman" w:eastAsia="Times New Roman" w:hAnsi="Times New Roman"/>
                 <w:rtl w:val="0"/>
               </w:rPr>
               <w:t xml:space="preserve">Control de versiones y colaboración del equipo.</w:t>
@@ -1577,6 +1443,258 @@
               <w:rPr>
                 <w:rtl w:val="0"/>
               </w:rPr>
+            </w:r>
+          </w:p>
+        </w:tc>
+      </w:tr>
+      <w:tr>
+        <w:trPr>
+          <w:cantSplit w:val="0"/>
+          <w:tblHeader w:val="0"/>
+        </w:trPr>
+        <w:tc>
+          <w:tcPr/>
+          <w:p>
+            <w:pPr>
+              <w:spacing w:line="240" w:lineRule="auto"/>
+              <w:ind w:left="720" w:firstLine="0"/>
+              <w:rPr>
+                <w:rFonts w:ascii="Times New Roman" w:cs="Times New Roman" w:eastAsia="Times New Roman" w:hAnsi="Times New Roman"/>
+              </w:rPr>
+            </w:pPr>
+            <w:r>
+              <w:rPr>
+                <w:rFonts w:ascii="Times New Roman" w:cs="Times New Roman" w:eastAsia="Times New Roman" w:hAnsi="Times New Roman"/>
+                <w:rtl w:val="0"/>
+              </w:rPr>
+              <w:t xml:space="preserve">Backend</w:t>
+            </w:r>
+          </w:p>
+        </w:tc>
+        <w:tc>
+          <w:tcPr/>
+          <w:p>
+            <w:pPr>
+              <w:spacing w:line="240" w:lineRule="auto"/>
+              <w:ind w:left="720" w:firstLine="0"/>
+              <w:rPr>
+                <w:rFonts w:ascii="Times New Roman" w:cs="Times New Roman" w:eastAsia="Times New Roman" w:hAnsi="Times New Roman"/>
+              </w:rPr>
+            </w:pPr>
+            <w:r>
+              <w:rPr>
+                <w:rFonts w:ascii="Times New Roman" w:cs="Times New Roman" w:eastAsia="Times New Roman" w:hAnsi="Times New Roman"/>
+                <w:rtl w:val="0"/>
+              </w:rPr>
+              <w:t xml:space="preserve">Transbank SDK (Webpay Plus)</w:t>
+            </w:r>
+          </w:p>
+        </w:tc>
+        <w:tc>
+          <w:tcPr/>
+          <w:p>
+            <w:pPr>
+              <w:spacing w:line="240" w:lineRule="auto"/>
+              <w:ind w:left="720" w:firstLine="0"/>
+              <w:rPr>
+                <w:rFonts w:ascii="Times New Roman" w:cs="Times New Roman" w:eastAsia="Times New Roman" w:hAnsi="Times New Roman"/>
+              </w:rPr>
+            </w:pPr>
+            <w:r>
+              <w:rPr>
+                <w:rFonts w:ascii="Times New Roman" w:cs="Times New Roman" w:eastAsia="Times New Roman" w:hAnsi="Times New Roman"/>
+                <w:rtl w:val="0"/>
+              </w:rPr>
+              <w:t xml:space="preserve">Procesamiento de pagos en línea mediante Webpay Plus.</w:t>
+            </w:r>
+          </w:p>
+        </w:tc>
+      </w:tr>
+      <w:tr>
+        <w:trPr>
+          <w:cantSplit w:val="0"/>
+          <w:tblHeader w:val="0"/>
+        </w:trPr>
+        <w:tc>
+          <w:tcPr/>
+          <w:p>
+            <w:pPr>
+              <w:spacing w:line="240" w:lineRule="auto"/>
+              <w:ind w:left="720" w:firstLine="0"/>
+              <w:rPr>
+                <w:rFonts w:ascii="Cambria" w:cs="Cambria" w:eastAsia="Cambria" w:hAnsi="Cambria"/>
+              </w:rPr>
+            </w:pPr>
+            <w:r>
+              <w:rPr>
+                <w:rFonts w:ascii="Cambria" w:cs="Cambria" w:eastAsia="Cambria" w:hAnsi="Cambria"/>
+                <w:rtl w:val="0"/>
+              </w:rPr>
+              <w:t xml:space="preserve">Frontend</w:t>
+            </w:r>
+          </w:p>
+        </w:tc>
+        <w:tc>
+          <w:tcPr/>
+          <w:p>
+            <w:pPr>
+              <w:spacing w:line="240" w:lineRule="auto"/>
+              <w:ind w:left="720" w:firstLine="0"/>
+              <w:rPr>
+                <w:rFonts w:ascii="Cambria" w:cs="Cambria" w:eastAsia="Cambria" w:hAnsi="Cambria"/>
+              </w:rPr>
+            </w:pPr>
+            <w:r>
+              <w:rPr>
+                <w:rFonts w:ascii="Cambria" w:cs="Cambria" w:eastAsia="Cambria" w:hAnsi="Cambria"/>
+                <w:rtl w:val="0"/>
+              </w:rPr>
+              <w:t xml:space="preserve">Leaflet</w:t>
+            </w:r>
+          </w:p>
+        </w:tc>
+        <w:tc>
+          <w:tcPr/>
+          <w:p>
+            <w:pPr>
+              <w:spacing w:line="240" w:lineRule="auto"/>
+              <w:ind w:left="720" w:firstLine="0"/>
+              <w:rPr>
+                <w:rFonts w:ascii="Cambria" w:cs="Cambria" w:eastAsia="Cambria" w:hAnsi="Cambria"/>
+              </w:rPr>
+            </w:pPr>
+            <w:r>
+              <w:rPr>
+                <w:rFonts w:ascii="Cambria" w:cs="Cambria" w:eastAsia="Cambria" w:hAnsi="Cambria"/>
+                <w:rtl w:val="0"/>
+              </w:rPr>
+              <w:t xml:space="preserve">Motor de mapas utilizado por React Leaflet para la visualización geográfica.</w:t>
+            </w:r>
+          </w:p>
+        </w:tc>
+      </w:tr>
+      <w:tr>
+        <w:trPr>
+          <w:cantSplit w:val="0"/>
+          <w:tblHeader w:val="0"/>
+        </w:trPr>
+        <w:tc>
+          <w:tcPr/>
+          <w:p>
+            <w:pPr>
+              <w:spacing w:line="240" w:lineRule="auto"/>
+              <w:ind w:left="720" w:firstLine="0"/>
+              <w:rPr>
+                <w:rFonts w:ascii="Cambria" w:cs="Cambria" w:eastAsia="Cambria" w:hAnsi="Cambria"/>
+              </w:rPr>
+            </w:pPr>
+            <w:r>
+              <w:rPr>
+                <w:rFonts w:ascii="Cambria" w:cs="Cambria" w:eastAsia="Cambria" w:hAnsi="Cambria"/>
+                <w:rtl w:val="0"/>
+              </w:rPr>
+              <w:t xml:space="preserve">Frontend</w:t>
+            </w:r>
+          </w:p>
+        </w:tc>
+        <w:tc>
+          <w:tcPr/>
+          <w:p>
+            <w:pPr>
+              <w:spacing w:line="240" w:lineRule="auto"/>
+              <w:ind w:left="720" w:firstLine="0"/>
+              <w:rPr>
+                <w:rFonts w:ascii="Cambria" w:cs="Cambria" w:eastAsia="Cambria" w:hAnsi="Cambria"/>
+              </w:rPr>
+            </w:pPr>
+            <w:r>
+              <w:rPr>
+                <w:rFonts w:ascii="Cambria" w:cs="Cambria" w:eastAsia="Cambria" w:hAnsi="Cambria"/>
+                <w:rtl w:val="0"/>
+              </w:rPr>
+              <w:t xml:space="preserve">FullCalendar</w:t>
+            </w:r>
+          </w:p>
+        </w:tc>
+        <w:tc>
+          <w:tcPr/>
+          <w:p>
+            <w:pPr>
+              <w:spacing w:line="240" w:lineRule="auto"/>
+              <w:ind w:left="720" w:firstLine="0"/>
+              <w:rPr>
+                <w:rFonts w:ascii="Cambria" w:cs="Cambria" w:eastAsia="Cambria" w:hAnsi="Cambria"/>
+              </w:rPr>
+            </w:pPr>
+            <w:r>
+              <w:rPr>
+                <w:rFonts w:ascii="Cambria" w:cs="Cambria" w:eastAsia="Cambria" w:hAnsi="Cambria"/>
+                <w:rtl w:val="0"/>
+              </w:rPr>
+              <w:t xml:space="preserve">Calendario interactivo para la programación y visualización de capacitaciones, visitas y asesorías.</w:t>
+            </w:r>
+          </w:p>
+        </w:tc>
+      </w:tr>
+      <w:tr>
+        <w:trPr>
+          <w:cantSplit w:val="0"/>
+          <w:tblHeader w:val="0"/>
+        </w:trPr>
+        <w:tc>
+          <w:tcPr/>
+          <w:p>
+            <w:pPr>
+              <w:spacing w:line="240" w:lineRule="auto"/>
+              <w:ind w:left="720" w:firstLine="0"/>
+              <w:rPr>
+                <w:rFonts w:ascii="Cambria" w:cs="Cambria" w:eastAsia="Cambria" w:hAnsi="Cambria"/>
+              </w:rPr>
+            </w:pPr>
+            <w:r>
+              <w:rPr>
+                <w:rFonts w:ascii="Cambria" w:cs="Cambria" w:eastAsia="Cambria" w:hAnsi="Cambria"/>
+                <w:rtl w:val="0"/>
+              </w:rPr>
+              <w:t xml:space="preserve">Frontend</w:t>
+            </w:r>
+          </w:p>
+        </w:tc>
+        <w:tc>
+          <w:tcPr/>
+          <w:p>
+            <w:pPr>
+              <w:spacing w:line="240" w:lineRule="auto"/>
+              <w:ind w:left="720" w:firstLine="0"/>
+              <w:rPr>
+                <w:rFonts w:ascii="Cambria" w:cs="Cambria" w:eastAsia="Cambria" w:hAnsi="Cambria"/>
+              </w:rPr>
+            </w:pPr>
+            <w:r>
+              <w:rPr>
+                <w:rFonts w:ascii="Cambria" w:cs="Cambria" w:eastAsia="Cambria" w:hAnsi="Cambria"/>
+                <w:rtl w:val="0"/>
+              </w:rPr>
+              <w:t xml:space="preserve">Recharts</w:t>
+            </w:r>
+          </w:p>
+        </w:tc>
+        <w:tc>
+          <w:tcPr/>
+          <w:p>
+            <w:pPr>
+              <w:spacing w:line="240" w:lineRule="auto"/>
+              <w:ind w:left="720" w:firstLine="0"/>
+              <w:rPr>
+                <w:rFonts w:ascii="Cambria" w:cs="Cambria" w:eastAsia="Cambria" w:hAnsi="Cambria"/>
+              </w:rPr>
+            </w:pPr>
+            <w:r>
+              <w:rPr>
+                <w:rFonts w:ascii="Cambria" w:cs="Cambria" w:eastAsia="Cambria" w:hAnsi="Cambria"/>
+                <w:rtl w:val="0"/>
+              </w:rPr>
+              <w:t xml:space="preserve">Generación de gráficos y estadísticas para dashboards e indicadores.</w:t>
             </w:r>
           </w:p>
         </w:tc>

</xml_diff>